<commit_message>
test: Added a test for formatCurrency with GBP and UK Locale
</commit_message>
<xml_diff>
--- a/docstencil-core/src/test/resources/fixtures/e2e_built_in_functions_in.docx
+++ b/docstencil-core/src/test/resources/fixtures/e2e_built_in_functions_in.docx
@@ -1,6 +1,6 @@
 
 <file path=word/document.xml><?xml version="1.0" encoding="utf-8"?>
-<w:document xmlns:o="urn:schemas-microsoft-com:office:office" xmlns:r="http://schemas.openxmlformats.org/officeDocument/2006/relationships" xmlns:v="urn:schemas-microsoft-com:vml" xmlns:w="http://schemas.openxmlformats.org/wordprocessingml/2006/main" xmlns:w10="urn:schemas-microsoft-com:office:word" xmlns:wp="http://schemas.openxmlformats.org/drawingml/2006/wordprocessingDrawing" xmlns:wps="http://schemas.microsoft.com/office/word/2010/wordprocessingShape" xmlns:wpg="http://schemas.microsoft.com/office/word/2010/wordprocessingGroup" xmlns:mc="http://schemas.openxmlformats.org/markup-compatibility/2006" xmlns:wp14="http://schemas.microsoft.com/office/word/2010/wordprocessingDrawing" xmlns:w14="http://schemas.microsoft.com/office/word/2010/wordml" xmlns:w15="http://schemas.microsoft.com/office/word/2012/wordml" mc:Ignorable="w14 wp14 w15">
+<w:document xmlns:o="urn:schemas-microsoft-com:office:office" xmlns:r="http://schemas.openxmlformats.org/officeDocument/2006/relationships" xmlns:v="urn:schemas-microsoft-com:vml" xmlns:w="http://schemas.openxmlformats.org/wordprocessingml/2006/main" xmlns:w10="urn:schemas-microsoft-com:office:word" xmlns:wp="http://schemas.openxmlformats.org/drawingml/2006/wordprocessingDrawing" xmlns:pic="http://schemas.openxmlformats.org/drawingml/2006/picture" xmlns:wps="http://schemas.microsoft.com/office/word/2010/wordprocessingShape" xmlns:wpg="http://schemas.microsoft.com/office/word/2010/wordprocessingGroup" xmlns:mc="http://schemas.openxmlformats.org/markup-compatibility/2006" xmlns:wp14="http://schemas.microsoft.com/office/word/2010/wordprocessingDrawing" xmlns:w14="http://schemas.microsoft.com/office/word/2010/wordml" xmlns:w15="http://schemas.microsoft.com/office/word/2012/wordml" mc:Ignorable="w14 wp14 w15">
   <w:body>
     <w:p>
       <w:pPr>
@@ -139,6 +139,116 @@
           <w:b/>
           <w:bCs/>
         </w:rPr>
+        <w:t>123.46</w:t>
+      </w:r>
+      <w:r>
+        <w:rPr/>
+        <w:t xml:space="preserve"> == {$format(numVar)}</w:t>
+      </w:r>
+    </w:p>
+    <w:p>
+      <w:pPr>
+        <w:pStyle w:val="Normal"/>
+        <w:rPr/>
+      </w:pPr>
+      <w:r>
+        <w:rPr>
+          <w:b/>
+          <w:bCs/>
+        </w:rPr>
+        <w:t>123</w:t>
+      </w:r>
+      <w:r>
+        <w:rPr/>
+        <w:t xml:space="preserve"> == {$format(123)}</w:t>
+      </w:r>
+    </w:p>
+    <w:p>
+      <w:pPr>
+        <w:pStyle w:val="Normal"/>
+        <w:rPr/>
+      </w:pPr>
+      <w:r>
+        <w:rPr>
+          <w:b/>
+          <w:bCs/>
+        </w:rPr>
+        <w:t>08/20/2020</w:t>
+      </w:r>
+      <w:r>
+        <w:rPr/>
+        <w:t xml:space="preserve"> == {$formatDate(dateVar, "MM/dd/yyyy")}</w:t>
+      </w:r>
+    </w:p>
+    <w:p>
+      <w:pPr>
+        <w:pStyle w:val="Normal"/>
+        <w:rPr/>
+      </w:pPr>
+      <w:r>
+        <w:rPr>
+          <w:b/>
+          <w:bCs/>
+        </w:rPr>
+        <w:t>08/20/2020</w:t>
+      </w:r>
+      <w:r>
+        <w:rPr/>
+        <w:t xml:space="preserve"> == {$formatDate(dateTimeVar, "MM/dd/yyyy")}</w:t>
+      </w:r>
+    </w:p>
+    <w:p>
+      <w:pPr>
+        <w:pStyle w:val="Normal"/>
+        <w:rPr/>
+      </w:pPr>
+      <w:r>
+        <w:rPr>
+          <w:b/>
+          <w:bCs/>
+        </w:rPr>
+        <w:t>2020/08/20</w:t>
+      </w:r>
+      <w:r>
+        <w:rPr/>
+        <w:t xml:space="preserve"> == {$format(dateVar)}</w:t>
+      </w:r>
+    </w:p>
+    <w:p>
+      <w:pPr>
+        <w:pStyle w:val="Normal"/>
+        <w:rPr/>
+      </w:pPr>
+      <w:r>
+        <w:rPr>
+          <w:b/>
+          <w:bCs/>
+        </w:rPr>
+        <w:t>2020/08/20 14:42</w:t>
+      </w:r>
+      <w:r>
+        <w:rPr/>
+        <w:t xml:space="preserve"> == {$format(dateTimeVar)}</w:t>
+      </w:r>
+    </w:p>
+    <w:p>
+      <w:pPr>
+        <w:pStyle w:val="Normal"/>
+        <w:rPr/>
+      </w:pPr>
+      <w:r>
+        <w:rPr>
+          <w:rFonts w:eastAsia="Noto Serif CJK SC" w:cs="Noto Sans Devanagari"/>
+          <w:b/>
+          <w:bCs/>
+        </w:rPr>
+        <w:t>£</w:t>
+      </w:r>
+      <w:r>
+        <w:rPr>
+          <w:b/>
+          <w:bCs/>
+        </w:rPr>
         <w:t>123.4</w:t>
       </w:r>
       <w:r>
@@ -150,92 +260,16 @@
       </w:r>
       <w:r>
         <w:rPr/>
-        <w:t xml:space="preserve"> == {$format(numVar)}</w:t>
-      </w:r>
-    </w:p>
-    <w:p>
-      <w:pPr>
-        <w:pStyle w:val="Normal"/>
-        <w:rPr/>
-      </w:pPr>
-      <w:r>
-        <w:rPr>
-          <w:b/>
-          <w:bCs/>
-        </w:rPr>
-        <w:t>123</w:t>
-      </w:r>
-      <w:r>
-        <w:rPr/>
-        <w:t xml:space="preserve"> == {$format(123)}</w:t>
-      </w:r>
-    </w:p>
-    <w:p>
-      <w:pPr>
-        <w:pStyle w:val="Normal"/>
-        <w:rPr/>
-      </w:pPr>
-      <w:r>
-        <w:rPr>
-          <w:b/>
-          <w:bCs/>
-        </w:rPr>
-        <w:t>08/20/2020</w:t>
-      </w:r>
-      <w:r>
-        <w:rPr/>
-        <w:t xml:space="preserve"> == {$formatDate(dateVar, "MM/dd/yyyy")}</w:t>
-      </w:r>
-    </w:p>
-    <w:p>
-      <w:pPr>
-        <w:pStyle w:val="Normal"/>
-        <w:rPr/>
-      </w:pPr>
-      <w:r>
-        <w:rPr>
-          <w:b/>
-          <w:bCs/>
-        </w:rPr>
-        <w:t>08/20/2020</w:t>
-      </w:r>
-      <w:r>
-        <w:rPr/>
-        <w:t xml:space="preserve"> == {$formatDate(dateTimeVar, "MM/dd/yyyy")}</w:t>
-      </w:r>
-    </w:p>
-    <w:p>
-      <w:pPr>
-        <w:pStyle w:val="Normal"/>
-        <w:rPr/>
-      </w:pPr>
-      <w:r>
-        <w:rPr>
-          <w:b/>
-          <w:bCs/>
-        </w:rPr>
-        <w:t>2020/08/20</w:t>
-      </w:r>
-      <w:r>
-        <w:rPr/>
-        <w:t xml:space="preserve"> == {$format(dateVar)}</w:t>
-      </w:r>
-    </w:p>
-    <w:p>
-      <w:pPr>
-        <w:pStyle w:val="Normal"/>
-        <w:rPr/>
-      </w:pPr>
-      <w:r>
-        <w:rPr>
-          <w:b/>
-          <w:bCs/>
-        </w:rPr>
-        <w:t>2020/08/20 14:42</w:t>
-      </w:r>
-      <w:r>
-        <w:rPr/>
-        <w:t xml:space="preserve"> == {$format(dateTimeVar)}</w:t>
+        <w:t xml:space="preserve"> == {$formatCurrency(numVar, "GBP")}</w:t>
+      </w:r>
+    </w:p>
+    <w:p>
+      <w:pPr>
+        <w:pStyle w:val="Normal"/>
+        <w:rPr/>
+      </w:pPr>
+      <w:r>
+        <w:rPr/>
       </w:r>
     </w:p>
     <w:sectPr>
@@ -320,7 +354,7 @@
     </w:rPr>
   </w:style>
   <w:style w:type="paragraph" w:styleId="Caption">
-    <w:name w:val="Caption"/>
+    <w:name w:val="caption"/>
     <w:basedOn w:val="Normal"/>
     <w:qFormat/>
     <w:pPr>

</xml_diff>

<commit_message>
test: Additional test for using USD with UK Locale
</commit_message>
<xml_diff>
--- a/docstencil-core/src/test/resources/fixtures/e2e_built_in_functions_in.docx
+++ b/docstencil-core/src/test/resources/fixtures/e2e_built_in_functions_in.docx
@@ -249,14 +249,7 @@
           <w:b/>
           <w:bCs/>
         </w:rPr>
-        <w:t>123.4</w:t>
-      </w:r>
-      <w:r>
-        <w:rPr>
-          <w:b/>
-          <w:bCs/>
-        </w:rPr>
-        <w:t>6</w:t>
+        <w:t>123.46</w:t>
       </w:r>
       <w:r>
         <w:rPr/>
@@ -269,7 +262,23 @@
         <w:rPr/>
       </w:pPr>
       <w:r>
-        <w:rPr/>
+        <w:rPr>
+          <w:rFonts w:eastAsia="Noto Serif CJK SC" w:cs="Noto Sans Devanagari"/>
+          <w:b/>
+          <w:bCs/>
+        </w:rPr>
+        <w:t>USD</w:t>
+      </w:r>
+      <w:r>
+        <w:rPr>
+          <w:b/>
+          <w:bCs/>
+        </w:rPr>
+        <w:t>123.46</w:t>
+      </w:r>
+      <w:r>
+        <w:rPr/>
+        <w:t xml:space="preserve"> == {$formatCurrency(numVar, "USD")}</w:t>
       </w:r>
     </w:p>
     <w:sectPr>

</xml_diff>